<commit_message>
Update French translation notes and resources for 2026-09-01 release
</commit_message>
<xml_diff>
--- a/fra/docx/08.content.docx
+++ b/fra/docx/08.content.docx
@@ -254,54 +254,36 @@
         </w:rPr>
         <w:t xml:space="preserve"> L’époque des juges est celle qui suit la conquête de Canaan sous Josué et qui finit avec le prophète Samuel, dernier juge d’Israël. Samuel instaure la monarchie quand il oint Saül comme premier roi d’Israël. Le livre des Juges raconte l’histoire du peuple d’Israël pendant la période des juges jusque avant Samuel. (Noter que le livre de Josué raconte la conquête de Canaan, mais qu’Israël n’arrive pas à conquérir tout le pays pendant la vie de Josué. La conquête continue même pendant l’époque des juges : voir </w:t>
       </w:r>
-      <w:hyperlink r:id="rId15">
-        <w:r>
-          <w:rPr>
-            <w:lang w:val="fr_FR" w:bidi="fr_FR"/>
-          </w:rPr>
-          <w:rPr>
-            <w:color w:val="0000EE"/>
-            <w:u w:val="single"/>
-          </w:rPr>
-          <w:t>Juges 18.1–2</w:t>
-        </w:r>
-      </w:hyperlink>
+      <w:r>
+        <w:rPr>
+          <w:lang w:val="fr_FR" w:bidi="fr_FR"/>
+        </w:rPr>
+        <w:t>Juges 18.1–2</w:t>
+      </w:r>
       <w:r>
         <w:rPr>
           <w:lang w:val="fr_FR" w:bidi="fr_FR"/>
         </w:rPr>
         <w:t xml:space="preserve">, </w:t>
       </w:r>
-      <w:hyperlink r:id="rId16">
-        <w:r>
-          <w:rPr>
-            <w:lang w:val="fr_FR" w:bidi="fr_FR"/>
-          </w:rPr>
-          <w:rPr>
-            <w:color w:val="0000EE"/>
-            <w:u w:val="single"/>
-          </w:rPr>
-          <w:t>7–12</w:t>
-        </w:r>
-      </w:hyperlink>
+      <w:r>
+        <w:rPr>
+          <w:lang w:val="fr_FR" w:bidi="fr_FR"/>
+        </w:rPr>
+        <w:t>7–12</w:t>
+      </w:r>
       <w:r>
         <w:rPr>
           <w:lang w:val="fr_FR" w:bidi="fr_FR"/>
         </w:rPr>
         <w:t xml:space="preserve">, </w:t>
       </w:r>
-      <w:hyperlink r:id="rId17">
-        <w:r>
-          <w:rPr>
-            <w:lang w:val="fr_FR" w:bidi="fr_FR"/>
-          </w:rPr>
-          <w:rPr>
-            <w:color w:val="0000EE"/>
-            <w:u w:val="single"/>
-          </w:rPr>
-          <w:t>27–29</w:t>
-        </w:r>
-      </w:hyperlink>
+      <w:r>
+        <w:rPr>
+          <w:lang w:val="fr_FR" w:bidi="fr_FR"/>
+        </w:rPr>
+        <w:t>27–29</w:t>
+      </w:r>
       <w:r>
         <w:rPr>
           <w:lang w:val="fr_FR" w:bidi="fr_FR"/>
@@ -1082,18 +1064,12 @@
         </w:rPr>
         <w:t xml:space="preserve"> Naomi fait référence au mariage lévirat. Voir note correspondante à « conserver le nom du défunt » au verset </w:t>
       </w:r>
-      <w:hyperlink r:id="rId18">
-        <w:r>
-          <w:rPr>
-            <w:lang w:val="fr_FR" w:bidi="fr_FR"/>
-          </w:rPr>
-          <w:rPr>
-            <w:color w:val="0000EE"/>
-            <w:u w:val="single"/>
-          </w:rPr>
-          <w:t>4.5</w:t>
-        </w:r>
-      </w:hyperlink>
+      <w:r>
+        <w:rPr>
+          <w:lang w:val="fr_FR" w:bidi="fr_FR"/>
+        </w:rPr>
+        <w:t>4.5</w:t>
+      </w:r>
       <w:r>
         <w:rPr>
           <w:lang w:val="fr_FR" w:bidi="fr_FR"/>
@@ -1407,18 +1383,12 @@
         </w:rPr>
         <w:t xml:space="preserve">Le sens est que Ruth espère que quelqu’un lui montrera de la compassion et la laissera ramasser des épis d’orge dans son champ. C’est le mot que Ruth utilisera pour parler de la bonté de Boaz envers elle, pourtant une étrangère (voir verset 10). À titre d’exemple, ce mot est également utilisé pour décrire la disposition favorable du roi Assuérus envers Esther (voir par exemple </w:t>
       </w:r>
-      <w:hyperlink r:id="rId19">
-        <w:r>
-          <w:rPr>
-            <w:lang w:val="fr_FR" w:bidi="fr_FR"/>
-          </w:rPr>
-          <w:rPr>
-            <w:color w:val="0000EE"/>
-            <w:u w:val="single"/>
-          </w:rPr>
-          <w:t>Esther 2.17</w:t>
-        </w:r>
-      </w:hyperlink>
+      <w:r>
+        <w:rPr>
+          <w:lang w:val="fr_FR" w:bidi="fr_FR"/>
+        </w:rPr>
+        <w:t>Esther 2.17</w:t>
+      </w:r>
       <w:r>
         <w:rPr>
           <w:lang w:val="fr_FR" w:bidi="fr_FR"/>
@@ -1569,36 +1539,24 @@
         </w:rPr>
         <w:t xml:space="preserve"> Le mot hébreu traduit « se prosterna » signifie se courber, s’abaisser. Dépendamment des contextes et de la présence d’autres mots dans la phrase, il peut décrire l’action de se prosterner de façon plus ou moins prononcée. Noter que ce verbe peut décrire (1) une action qui reflète une dévotion à Dieu (voir par exemple Ésaïe </w:t>
       </w:r>
-      <w:hyperlink r:id="rId20">
-        <w:r>
-          <w:rPr>
-            <w:lang w:val="fr_FR" w:bidi="fr_FR"/>
-          </w:rPr>
-          <w:rPr>
-            <w:color w:val="0000EE"/>
-            <w:u w:val="single"/>
-          </w:rPr>
-          <w:t>44.15</w:t>
-        </w:r>
-      </w:hyperlink>
+      <w:r>
+        <w:rPr>
+          <w:lang w:val="fr_FR" w:bidi="fr_FR"/>
+        </w:rPr>
+        <w:t>44.15</w:t>
+      </w:r>
       <w:r>
         <w:rPr>
           <w:lang w:val="fr_FR" w:bidi="fr_FR"/>
         </w:rPr>
         <w:t xml:space="preserve"> ou </w:t>
       </w:r>
-      <w:hyperlink r:id="rId21">
-        <w:r>
-          <w:rPr>
-            <w:lang w:val="fr_FR" w:bidi="fr_FR"/>
-          </w:rPr>
-          <w:rPr>
-            <w:color w:val="0000EE"/>
-            <w:u w:val="single"/>
-          </w:rPr>
-          <w:t>Néhémie 8.6</w:t>
-        </w:r>
-      </w:hyperlink>
+      <w:r>
+        <w:rPr>
+          <w:lang w:val="fr_FR" w:bidi="fr_FR"/>
+        </w:rPr>
+        <w:t>Néhémie 8.6</w:t>
+      </w:r>
       <w:r>
         <w:rPr>
           <w:lang w:val="fr_FR" w:bidi="fr_FR"/>
@@ -1627,36 +1585,24 @@
           <w:lang w:val="fr_FR" w:bidi="fr_FR"/>
         </w:rPr>
       </w:r>
-      <w:hyperlink r:id="rId22">
-        <w:r>
-          <w:rPr>
-            <w:lang w:val="fr_FR" w:bidi="fr_FR"/>
-          </w:rPr>
-          <w:rPr>
-            <w:color w:val="0000EE"/>
-            <w:u w:val="single"/>
-          </w:rPr>
-          <w:t>Genèse 23.7</w:t>
-        </w:r>
-      </w:hyperlink>
+      <w:r>
+        <w:rPr>
+          <w:lang w:val="fr_FR" w:bidi="fr_FR"/>
+        </w:rPr>
+        <w:t>Genèse 23.7</w:t>
+      </w:r>
       <w:r>
         <w:rPr>
           <w:lang w:val="fr_FR" w:bidi="fr_FR"/>
         </w:rPr>
         <w:t xml:space="preserve">, </w:t>
       </w:r>
-      <w:hyperlink r:id="rId23">
-        <w:r>
-          <w:rPr>
-            <w:lang w:val="fr_FR" w:bidi="fr_FR"/>
-          </w:rPr>
-          <w:rPr>
-            <w:color w:val="0000EE"/>
-            <w:u w:val="single"/>
-          </w:rPr>
-          <w:t>12</w:t>
-        </w:r>
-      </w:hyperlink>
+      <w:r>
+        <w:rPr>
+          <w:lang w:val="fr_FR" w:bidi="fr_FR"/>
+        </w:rPr>
+        <w:t>12</w:t>
+      </w:r>
       <w:r>
         <w:rPr>
           <w:lang w:val="fr_FR" w:bidi="fr_FR"/>
@@ -1680,18 +1626,12 @@
           <w:lang w:val="fr_FR" w:bidi="fr_FR"/>
         </w:rPr>
       </w:r>
-      <w:hyperlink r:id="rId24">
-        <w:r>
-          <w:rPr>
-            <w:lang w:val="fr_FR" w:bidi="fr_FR"/>
-          </w:rPr>
-          <w:rPr>
-            <w:color w:val="0000EE"/>
-            <w:u w:val="single"/>
-          </w:rPr>
-          <w:t>Genèse 27.29</w:t>
-        </w:r>
-      </w:hyperlink>
+      <w:r>
+        <w:rPr>
+          <w:lang w:val="fr_FR" w:bidi="fr_FR"/>
+        </w:rPr>
+        <w:t>Genèse 27.29</w:t>
+      </w:r>
       <w:r>
         <w:rPr>
           <w:lang w:val="fr_FR" w:bidi="fr_FR"/>
@@ -1715,54 +1655,36 @@
           <w:lang w:val="fr_FR" w:bidi="fr_FR"/>
         </w:rPr>
       </w:r>
-      <w:hyperlink r:id="rId25">
-        <w:r>
-          <w:rPr>
-            <w:lang w:val="fr_FR" w:bidi="fr_FR"/>
-          </w:rPr>
-          <w:rPr>
-            <w:color w:val="0000EE"/>
-            <w:u w:val="single"/>
-          </w:rPr>
-          <w:t>Genèse 33.3</w:t>
-        </w:r>
-      </w:hyperlink>
+      <w:r>
+        <w:rPr>
+          <w:lang w:val="fr_FR" w:bidi="fr_FR"/>
+        </w:rPr>
+        <w:t>Genèse 33.3</w:t>
+      </w:r>
       <w:r>
         <w:rPr>
           <w:lang w:val="fr_FR" w:bidi="fr_FR"/>
         </w:rPr>
         <w:t xml:space="preserve">, </w:t>
       </w:r>
-      <w:hyperlink r:id="rId26">
-        <w:r>
-          <w:rPr>
-            <w:lang w:val="fr_FR" w:bidi="fr_FR"/>
-          </w:rPr>
-          <w:rPr>
-            <w:color w:val="0000EE"/>
-            <w:u w:val="single"/>
-          </w:rPr>
-          <w:t>6</w:t>
-        </w:r>
-      </w:hyperlink>
+      <w:r>
+        <w:rPr>
+          <w:lang w:val="fr_FR" w:bidi="fr_FR"/>
+        </w:rPr>
+        <w:t>6</w:t>
+      </w:r>
       <w:r>
         <w:rPr>
           <w:lang w:val="fr_FR" w:bidi="fr_FR"/>
         </w:rPr>
         <w:t xml:space="preserve">, </w:t>
       </w:r>
-      <w:hyperlink r:id="rId27">
-        <w:r>
-          <w:rPr>
-            <w:lang w:val="fr_FR" w:bidi="fr_FR"/>
-          </w:rPr>
-          <w:rPr>
-            <w:color w:val="0000EE"/>
-            <w:u w:val="single"/>
-          </w:rPr>
-          <w:t>7</w:t>
-        </w:r>
-      </w:hyperlink>
+      <w:r>
+        <w:rPr>
+          <w:lang w:val="fr_FR" w:bidi="fr_FR"/>
+        </w:rPr>
+        <w:t>7</w:t>
+      </w:r>
       <w:r>
         <w:rPr>
           <w:lang w:val="fr_FR" w:bidi="fr_FR"/>
@@ -1786,18 +1708,12 @@
           <w:lang w:val="fr_FR" w:bidi="fr_FR"/>
         </w:rPr>
       </w:r>
-      <w:hyperlink r:id="rId28">
-        <w:r>
-          <w:rPr>
-            <w:lang w:val="fr_FR" w:bidi="fr_FR"/>
-          </w:rPr>
-          <w:rPr>
-            <w:color w:val="0000EE"/>
-            <w:u w:val="single"/>
-          </w:rPr>
-          <w:t>Genèse 42.6</w:t>
-        </w:r>
-      </w:hyperlink>
+      <w:r>
+        <w:rPr>
+          <w:lang w:val="fr_FR" w:bidi="fr_FR"/>
+        </w:rPr>
+        <w:t>Genèse 42.6</w:t>
+      </w:r>
       <w:r>
         <w:rPr>
           <w:lang w:val="fr_FR" w:bidi="fr_FR"/>
@@ -1821,18 +1737,12 @@
           <w:lang w:val="fr_FR" w:bidi="fr_FR"/>
         </w:rPr>
       </w:r>
-      <w:hyperlink r:id="rId29">
-        <w:r>
-          <w:rPr>
-            <w:lang w:val="fr_FR" w:bidi="fr_FR"/>
-          </w:rPr>
-          <w:rPr>
-            <w:color w:val="0000EE"/>
-            <w:u w:val="single"/>
-          </w:rPr>
-          <w:t>Exode 18.7</w:t>
-        </w:r>
-      </w:hyperlink>
+      <w:r>
+        <w:rPr>
+          <w:lang w:val="fr_FR" w:bidi="fr_FR"/>
+        </w:rPr>
+        <w:t>Exode 18.7</w:t>
+      </w:r>
       <w:r>
         <w:rPr>
           <w:lang w:val="fr_FR" w:bidi="fr_FR"/>
@@ -1856,18 +1766,12 @@
           <w:lang w:val="fr_FR" w:bidi="fr_FR"/>
         </w:rPr>
       </w:r>
-      <w:hyperlink r:id="rId30">
-        <w:r>
-          <w:rPr>
-            <w:lang w:val="fr_FR" w:bidi="fr_FR"/>
-          </w:rPr>
-          <w:rPr>
-            <w:color w:val="0000EE"/>
-            <w:u w:val="single"/>
-          </w:rPr>
-          <w:t>Ruth 2.10</w:t>
-        </w:r>
-      </w:hyperlink>
+      <w:r>
+        <w:rPr>
+          <w:lang w:val="fr_FR" w:bidi="fr_FR"/>
+        </w:rPr>
+        <w:t>Ruth 2.10</w:t>
+      </w:r>
       <w:r>
         <w:rPr>
           <w:lang w:val="fr_FR" w:bidi="fr_FR"/>
@@ -1891,18 +1795,12 @@
           <w:lang w:val="fr_FR" w:bidi="fr_FR"/>
         </w:rPr>
       </w:r>
-      <w:hyperlink r:id="rId31">
-        <w:r>
-          <w:rPr>
-            <w:lang w:val="fr_FR" w:bidi="fr_FR"/>
-          </w:rPr>
-          <w:rPr>
-            <w:color w:val="0000EE"/>
-            <w:u w:val="single"/>
-          </w:rPr>
-          <w:t>1 Samuel 20.41</w:t>
-        </w:r>
-      </w:hyperlink>
+      <w:r>
+        <w:rPr>
+          <w:lang w:val="fr_FR" w:bidi="fr_FR"/>
+        </w:rPr>
+        <w:t>1 Samuel 20.41</w:t>
+      </w:r>
       <w:r>
         <w:rPr>
           <w:lang w:val="fr_FR" w:bidi="fr_FR"/>
@@ -1926,18 +1824,12 @@
           <w:lang w:val="fr_FR" w:bidi="fr_FR"/>
         </w:rPr>
       </w:r>
-      <w:hyperlink r:id="rId32">
-        <w:r>
-          <w:rPr>
-            <w:lang w:val="fr_FR" w:bidi="fr_FR"/>
-          </w:rPr>
-          <w:rPr>
-            <w:color w:val="0000EE"/>
-            <w:u w:val="single"/>
-          </w:rPr>
-          <w:t>1 Samuel 24.9</w:t>
-        </w:r>
-      </w:hyperlink>
+      <w:r>
+        <w:rPr>
+          <w:lang w:val="fr_FR" w:bidi="fr_FR"/>
+        </w:rPr>
+        <w:t>1 Samuel 24.9</w:t>
+      </w:r>
       <w:r>
         <w:rPr>
           <w:lang w:val="fr_FR" w:bidi="fr_FR"/>
@@ -2051,36 +1943,24 @@
         </w:rPr>
         <w:t xml:space="preserve"> Le mot hébreu traduit « naissance » signifie littéralement « naissance ». Ce mot indique une relation familiale, qu’elle soit étroite ou large. Selon les contextes, il pourrait être traduit « patrie », « enfants », « parenté », « famille », « descendance », « origine » ou « ethnie » en français. À titre d’exemple, ce mot est également utilisé dans </w:t>
       </w:r>
-      <w:hyperlink r:id="rId33">
-        <w:r>
-          <w:rPr>
-            <w:lang w:val="fr_FR" w:bidi="fr_FR"/>
-          </w:rPr>
-          <w:rPr>
-            <w:color w:val="0000EE"/>
-            <w:u w:val="single"/>
-          </w:rPr>
-          <w:t>Esther 2.10</w:t>
-        </w:r>
-      </w:hyperlink>
+      <w:r>
+        <w:rPr>
+          <w:lang w:val="fr_FR" w:bidi="fr_FR"/>
+        </w:rPr>
+        <w:t>Esther 2.10</w:t>
+      </w:r>
       <w:r>
         <w:rPr>
           <w:lang w:val="fr_FR" w:bidi="fr_FR"/>
         </w:rPr>
         <w:t xml:space="preserve"> (« famille »), 20 (« naissance ») ; </w:t>
       </w:r>
-      <w:hyperlink r:id="rId34">
-        <w:r>
-          <w:rPr>
-            <w:lang w:val="fr_FR" w:bidi="fr_FR"/>
-          </w:rPr>
-          <w:rPr>
-            <w:color w:val="0000EE"/>
-            <w:u w:val="single"/>
-          </w:rPr>
-          <w:t>8.6</w:t>
-        </w:r>
-      </w:hyperlink>
+      <w:r>
+        <w:rPr>
+          <w:lang w:val="fr_FR" w:bidi="fr_FR"/>
+        </w:rPr>
+        <w:t>8.6</w:t>
+      </w:r>
       <w:r>
         <w:rPr>
           <w:lang w:val="fr_FR" w:bidi="fr_FR"/>
@@ -2135,18 +2015,12 @@
         </w:rPr>
         <w:t xml:space="preserve"> Voir </w:t>
       </w:r>
-      <w:hyperlink r:id="rId35">
-        <w:r>
-          <w:rPr>
-            <w:lang w:val="fr_FR" w:bidi="fr_FR"/>
-          </w:rPr>
-          <w:rPr>
-            <w:color w:val="0000EE"/>
-            <w:u w:val="single"/>
-          </w:rPr>
-          <w:t>Exode 19.4</w:t>
-        </w:r>
-      </w:hyperlink>
+      <w:r>
+        <w:rPr>
+          <w:lang w:val="fr_FR" w:bidi="fr_FR"/>
+        </w:rPr>
+        <w:t>Exode 19.4</w:t>
+      </w:r>
       <w:r>
         <w:rPr>
           <w:lang w:val="fr_FR" w:bidi="fr_FR"/>
@@ -2316,54 +2190,36 @@
         </w:rPr>
         <w:t xml:space="preserve"> (voir </w:t>
       </w:r>
-      <w:hyperlink r:id="rId36">
-        <w:r>
-          <w:rPr>
-            <w:lang w:val="fr_FR" w:bidi="fr_FR"/>
-          </w:rPr>
-          <w:rPr>
-            <w:color w:val="0000EE"/>
-            <w:u w:val="single"/>
-          </w:rPr>
-          <w:t>Lévitique 19.9</w:t>
-        </w:r>
-      </w:hyperlink>
+      <w:r>
+        <w:rPr>
+          <w:lang w:val="fr_FR" w:bidi="fr_FR"/>
+        </w:rPr>
+        <w:t>Lévitique 19.9</w:t>
+      </w:r>
       <w:r>
         <w:rPr>
           <w:lang w:val="fr_FR" w:bidi="fr_FR"/>
         </w:rPr>
         <w:t xml:space="preserve">, </w:t>
       </w:r>
-      <w:hyperlink r:id="rId37">
-        <w:r>
-          <w:rPr>
-            <w:lang w:val="fr_FR" w:bidi="fr_FR"/>
-          </w:rPr>
-          <w:rPr>
-            <w:color w:val="0000EE"/>
-            <w:u w:val="single"/>
-          </w:rPr>
-          <w:t>10</w:t>
-        </w:r>
-      </w:hyperlink>
+      <w:r>
+        <w:rPr>
+          <w:lang w:val="fr_FR" w:bidi="fr_FR"/>
+        </w:rPr>
+        <w:t>10</w:t>
+      </w:r>
       <w:r>
         <w:rPr>
           <w:lang w:val="fr_FR" w:bidi="fr_FR"/>
         </w:rPr>
         <w:t xml:space="preserve"> ; </w:t>
       </w:r>
-      <w:hyperlink r:id="rId38">
-        <w:r>
-          <w:rPr>
-            <w:lang w:val="fr_FR" w:bidi="fr_FR"/>
-          </w:rPr>
-          <w:rPr>
-            <w:color w:val="0000EE"/>
-            <w:u w:val="single"/>
-          </w:rPr>
-          <w:t>23.22</w:t>
-        </w:r>
-      </w:hyperlink>
+      <w:r>
+        <w:rPr>
+          <w:lang w:val="fr_FR" w:bidi="fr_FR"/>
+        </w:rPr>
+        <w:t>23.22</w:t>
+      </w:r>
       <w:r>
         <w:rPr>
           <w:lang w:val="fr_FR" w:bidi="fr_FR"/>
@@ -2552,162 +2408,108 @@
         </w:rPr>
         <w:t xml:space="preserve"> Ou « il fait partie de nos rédempteurs [potentiels] ». Le verbe hébreu traduit « ont droit de rachat » signifie être rédempteur ou racheter (voir </w:t>
       </w:r>
-      <w:hyperlink r:id="rId39">
-        <w:r>
-          <w:rPr>
-            <w:lang w:val="fr_FR" w:bidi="fr_FR"/>
-          </w:rPr>
-          <w:rPr>
-            <w:color w:val="0000EE"/>
-            <w:u w:val="single"/>
-          </w:rPr>
-          <w:t>Lévitique 25.25</w:t>
-        </w:r>
-      </w:hyperlink>
+      <w:r>
+        <w:rPr>
+          <w:lang w:val="fr_FR" w:bidi="fr_FR"/>
+        </w:rPr>
+        <w:t>Lévitique 25.25</w:t>
+      </w:r>
       <w:r>
         <w:rPr>
           <w:lang w:val="fr_FR" w:bidi="fr_FR"/>
         </w:rPr>
         <w:t xml:space="preserve"> [voir aussi verset 49] et </w:t>
       </w:r>
-      <w:hyperlink r:id="rId40">
-        <w:r>
-          <w:rPr>
-            <w:lang w:val="fr_FR" w:bidi="fr_FR"/>
-          </w:rPr>
-          <w:rPr>
-            <w:color w:val="0000EE"/>
-            <w:u w:val="single"/>
-          </w:rPr>
-          <w:t>Deutéronome 25.5–6</w:t>
-        </w:r>
-      </w:hyperlink>
+      <w:r>
+        <w:rPr>
+          <w:lang w:val="fr_FR" w:bidi="fr_FR"/>
+        </w:rPr>
+        <w:t>Deutéronome 25.5–6</w:t>
+      </w:r>
       <w:r>
         <w:rPr>
           <w:lang w:val="fr_FR" w:bidi="fr_FR"/>
         </w:rPr>
         <w:t xml:space="preserve">). Ce verbe peut être traduit « être rédempteur », « racheter » ou « avoir droit de rachat ». Il apparaît 22 fois dans le livre de Ruth : </w:t>
       </w:r>
-      <w:hyperlink r:id="rId41">
-        <w:r>
-          <w:rPr>
-            <w:lang w:val="fr_FR" w:bidi="fr_FR"/>
-          </w:rPr>
-          <w:rPr>
-            <w:color w:val="0000EE"/>
-            <w:u w:val="single"/>
-          </w:rPr>
-          <w:t>2.20</w:t>
-        </w:r>
-      </w:hyperlink>
+      <w:r>
+        <w:rPr>
+          <w:lang w:val="fr_FR" w:bidi="fr_FR"/>
+        </w:rPr>
+        <w:t>2.20</w:t>
+      </w:r>
       <w:r>
         <w:rPr>
           <w:lang w:val="fr_FR" w:bidi="fr_FR"/>
         </w:rPr>
         <w:t xml:space="preserve"> ; </w:t>
       </w:r>
-      <w:hyperlink r:id="rId42">
-        <w:r>
-          <w:rPr>
-            <w:lang w:val="fr_FR" w:bidi="fr_FR"/>
-          </w:rPr>
-          <w:rPr>
-            <w:color w:val="0000EE"/>
-            <w:u w:val="single"/>
-          </w:rPr>
-          <w:t>3.9</w:t>
-        </w:r>
-      </w:hyperlink>
+      <w:r>
+        <w:rPr>
+          <w:lang w:val="fr_FR" w:bidi="fr_FR"/>
+        </w:rPr>
+        <w:t>3.9</w:t>
+      </w:r>
       <w:r>
         <w:rPr>
           <w:lang w:val="fr_FR" w:bidi="fr_FR"/>
         </w:rPr>
         <w:t xml:space="preserve"> ; </w:t>
       </w:r>
-      <w:hyperlink r:id="rId43">
-        <w:r>
-          <w:rPr>
-            <w:lang w:val="fr_FR" w:bidi="fr_FR"/>
-          </w:rPr>
-          <w:rPr>
-            <w:color w:val="0000EE"/>
-            <w:u w:val="single"/>
-          </w:rPr>
-          <w:t>3.12</w:t>
-        </w:r>
-      </w:hyperlink>
+      <w:r>
+        <w:rPr>
+          <w:lang w:val="fr_FR" w:bidi="fr_FR"/>
+        </w:rPr>
+        <w:t>3.12</w:t>
+      </w:r>
       <w:r>
         <w:rPr>
           <w:lang w:val="fr_FR" w:bidi="fr_FR"/>
         </w:rPr>
         <w:t xml:space="preserve"> (3x) ; </w:t>
       </w:r>
-      <w:hyperlink r:id="rId44">
-        <w:r>
-          <w:rPr>
-            <w:lang w:val="fr_FR" w:bidi="fr_FR"/>
-          </w:rPr>
-          <w:rPr>
-            <w:color w:val="0000EE"/>
-            <w:u w:val="single"/>
-          </w:rPr>
-          <w:t>3.13</w:t>
-        </w:r>
-      </w:hyperlink>
+      <w:r>
+        <w:rPr>
+          <w:lang w:val="fr_FR" w:bidi="fr_FR"/>
+        </w:rPr>
+        <w:t>3.13</w:t>
+      </w:r>
       <w:r>
         <w:rPr>
           <w:lang w:val="fr_FR" w:bidi="fr_FR"/>
         </w:rPr>
         <w:t xml:space="preserve"> (4x) ; </w:t>
       </w:r>
-      <w:hyperlink r:id="rId45">
-        <w:r>
-          <w:rPr>
-            <w:lang w:val="fr_FR" w:bidi="fr_FR"/>
-          </w:rPr>
-          <w:rPr>
-            <w:color w:val="0000EE"/>
-            <w:u w:val="single"/>
-          </w:rPr>
-          <w:t>4.1</w:t>
-        </w:r>
-      </w:hyperlink>
+      <w:r>
+        <w:rPr>
+          <w:lang w:val="fr_FR" w:bidi="fr_FR"/>
+        </w:rPr>
+        <w:t>4.1</w:t>
+      </w:r>
       <w:r>
         <w:rPr>
           <w:lang w:val="fr_FR" w:bidi="fr_FR"/>
         </w:rPr>
         <w:t xml:space="preserve">, </w:t>
       </w:r>
-      <w:hyperlink r:id="rId46">
-        <w:r>
-          <w:rPr>
-            <w:lang w:val="fr_FR" w:bidi="fr_FR"/>
-          </w:rPr>
-          <w:rPr>
-            <w:color w:val="0000EE"/>
-            <w:u w:val="single"/>
-          </w:rPr>
-          <w:t>3</w:t>
-        </w:r>
-      </w:hyperlink>
+      <w:r>
+        <w:rPr>
+          <w:lang w:val="fr_FR" w:bidi="fr_FR"/>
+        </w:rPr>
+        <w:t>3</w:t>
+      </w:r>
       <w:r>
         <w:rPr>
           <w:lang w:val="fr_FR" w:bidi="fr_FR"/>
         </w:rPr>
         <w:t xml:space="preserve">, </w:t>
       </w:r>
-      <w:hyperlink r:id="rId47">
-        <w:r>
-          <w:rPr>
-            <w:lang w:val="fr_FR" w:bidi="fr_FR"/>
-          </w:rPr>
-          <w:rPr>
-            <w:color w:val="0000EE"/>
-            <w:u w:val="single"/>
-          </w:rPr>
-          <w:t>4</w:t>
-        </w:r>
-      </w:hyperlink>
+      <w:r>
+        <w:rPr>
+          <w:lang w:val="fr_FR" w:bidi="fr_FR"/>
+        </w:rPr>
+        <w:t>4</w:t>
+      </w:r>
       <w:r>
         <w:rPr>
           <w:lang w:val="fr_FR" w:bidi="fr_FR"/>
@@ -2810,36 +2612,24 @@
         </w:rPr>
         <w:t xml:space="preserve"> Souvent traduit « pour que tu sois heureuse » dans les versions françaises. Ce verbe est utilisé trois fois dans Ruth : </w:t>
       </w:r>
-      <w:hyperlink r:id="rId48">
-        <w:r>
-          <w:rPr>
-            <w:lang w:val="fr_FR" w:bidi="fr_FR"/>
-          </w:rPr>
-          <w:rPr>
-            <w:color w:val="0000EE"/>
-            <w:u w:val="single"/>
-          </w:rPr>
-          <w:t>3.1</w:t>
-        </w:r>
-      </w:hyperlink>
+      <w:r>
+        <w:rPr>
+          <w:lang w:val="fr_FR" w:bidi="fr_FR"/>
+        </w:rPr>
+        <w:t>3.1</w:t>
+      </w:r>
       <w:r>
         <w:rPr>
           <w:lang w:val="fr_FR" w:bidi="fr_FR"/>
         </w:rPr>
         <w:t xml:space="preserve">, </w:t>
       </w:r>
-      <w:hyperlink r:id="rId49">
-        <w:r>
-          <w:rPr>
-            <w:lang w:val="fr_FR" w:bidi="fr_FR"/>
-          </w:rPr>
-          <w:rPr>
-            <w:color w:val="0000EE"/>
-            <w:u w:val="single"/>
-          </w:rPr>
-          <w:t>7</w:t>
-        </w:r>
-      </w:hyperlink>
+      <w:r>
+        <w:rPr>
+          <w:lang w:val="fr_FR" w:bidi="fr_FR"/>
+        </w:rPr>
+        <w:t>7</w:t>
+      </w:r>
       <w:r>
         <w:rPr>
           <w:lang w:val="fr_FR" w:bidi="fr_FR"/>
@@ -3332,18 +3122,12 @@
         </w:rPr>
         <w:t xml:space="preserve"> C’est-à-dire que Boaz fait partie de ceux qui ont droit de rachat de tout ce qui appartenait à Élimélec (voir </w:t>
       </w:r>
-      <w:hyperlink r:id="rId41">
-        <w:r>
-          <w:rPr>
-            <w:lang w:val="fr_FR" w:bidi="fr_FR"/>
-          </w:rPr>
-          <w:rPr>
-            <w:color w:val="0000EE"/>
-            <w:u w:val="single"/>
-          </w:rPr>
-          <w:t>2.20</w:t>
-        </w:r>
-      </w:hyperlink>
+      <w:r>
+        <w:rPr>
+          <w:lang w:val="fr_FR" w:bidi="fr_FR"/>
+        </w:rPr>
+        <w:t>2.20</w:t>
+      </w:r>
       <w:r>
         <w:rPr>
           <w:lang w:val="fr_FR" w:bidi="fr_FR"/>
@@ -3494,54 +3278,36 @@
         </w:rPr>
         <w:t xml:space="preserve"> Le mot hébreu traduit « vertueuse » peut signifier la puissance, la force ou la valeur. Quand ce mot décrit une femme, il signifie valeur, excellence. Ce mot apparaît trois fois dans Ruth : </w:t>
       </w:r>
-      <w:hyperlink r:id="rId50">
-        <w:r>
-          <w:rPr>
-            <w:lang w:val="fr_FR" w:bidi="fr_FR"/>
-          </w:rPr>
-          <w:rPr>
-            <w:color w:val="0000EE"/>
-            <w:u w:val="single"/>
-          </w:rPr>
-          <w:t>2.1</w:t>
-        </w:r>
-      </w:hyperlink>
+      <w:r>
+        <w:rPr>
+          <w:lang w:val="fr_FR" w:bidi="fr_FR"/>
+        </w:rPr>
+        <w:t>2.1</w:t>
+      </w:r>
       <w:r>
         <w:rPr>
           <w:lang w:val="fr_FR" w:bidi="fr_FR"/>
         </w:rPr>
         <w:t xml:space="preserve"> (« puissant ») ; </w:t>
       </w:r>
-      <w:hyperlink r:id="rId51">
-        <w:r>
-          <w:rPr>
-            <w:lang w:val="fr_FR" w:bidi="fr_FR"/>
-          </w:rPr>
-          <w:rPr>
-            <w:color w:val="0000EE"/>
-            <w:u w:val="single"/>
-          </w:rPr>
-          <w:t>3.11</w:t>
-        </w:r>
-      </w:hyperlink>
+      <w:r>
+        <w:rPr>
+          <w:lang w:val="fr_FR" w:bidi="fr_FR"/>
+        </w:rPr>
+        <w:t>3.11</w:t>
+      </w:r>
       <w:r>
         <w:rPr>
           <w:lang w:val="fr_FR" w:bidi="fr_FR"/>
         </w:rPr>
         <w:t xml:space="preserve"> ; </w:t>
       </w:r>
-      <w:hyperlink r:id="rId52">
-        <w:r>
-          <w:rPr>
-            <w:lang w:val="fr_FR" w:bidi="fr_FR"/>
-          </w:rPr>
-          <w:rPr>
-            <w:color w:val="0000EE"/>
-            <w:u w:val="single"/>
-          </w:rPr>
-          <w:t>4.11</w:t>
-        </w:r>
-      </w:hyperlink>
+      <w:r>
+        <w:rPr>
+          <w:lang w:val="fr_FR" w:bidi="fr_FR"/>
+        </w:rPr>
+        <w:t>4.11</w:t>
+      </w:r>
       <w:r>
         <w:rPr>
           <w:lang w:val="fr_FR" w:bidi="fr_FR"/>
@@ -3576,18 +3342,12 @@
         </w:rPr>
         <w:t>« Une femme vertueuse est la couronne de son mari » (</w:t>
       </w:r>
-      <w:hyperlink r:id="rId53">
-        <w:r>
-          <w:rPr>
-            <w:lang w:val="fr_FR" w:bidi="fr_FR"/>
-          </w:rPr>
-          <w:rPr>
-            <w:color w:val="0000EE"/>
-            <w:u w:val="single"/>
-          </w:rPr>
-          <w:t>Proverbes 12.4</w:t>
-        </w:r>
-      </w:hyperlink>
+      <w:r>
+        <w:rPr>
+          <w:lang w:val="fr_FR" w:bidi="fr_FR"/>
+        </w:rPr>
+        <w:t>Proverbes 12.4</w:t>
+      </w:r>
       <w:r>
         <w:rPr>
           <w:lang w:val="fr_FR" w:bidi="fr_FR"/>
@@ -3617,18 +3377,12 @@
         </w:rPr>
         <w:t>« Qui peut trouver une femme vertueuse ? » (</w:t>
       </w:r>
-      <w:hyperlink r:id="rId54">
-        <w:r>
-          <w:rPr>
-            <w:lang w:val="fr_FR" w:bidi="fr_FR"/>
-          </w:rPr>
-          <w:rPr>
-            <w:color w:val="0000EE"/>
-            <w:u w:val="single"/>
-          </w:rPr>
-          <w:t>Proverbes 31.10</w:t>
-        </w:r>
-      </w:hyperlink>
+      <w:r>
+        <w:rPr>
+          <w:lang w:val="fr_FR" w:bidi="fr_FR"/>
+        </w:rPr>
+        <w:t>Proverbes 31.10</w:t>
+      </w:r>
       <w:r>
         <w:rPr>
           <w:lang w:val="fr_FR" w:bidi="fr_FR"/>
@@ -3976,18 +3730,12 @@
         </w:rPr>
         <w:t xml:space="preserve"> Il s’agit d’un mariage lévirat. Ce genre de mariage avait lieu seulement lorsqu’un homme mourait sans laisser de descendance (voir </w:t>
       </w:r>
-      <w:hyperlink r:id="rId40">
-        <w:r>
-          <w:rPr>
-            <w:lang w:val="fr_FR" w:bidi="fr_FR"/>
-          </w:rPr>
-          <w:rPr>
-            <w:color w:val="0000EE"/>
-            <w:u w:val="single"/>
-          </w:rPr>
-          <w:t>Deutéronome 25.5–6</w:t>
-        </w:r>
-      </w:hyperlink>
+      <w:r>
+        <w:rPr>
+          <w:lang w:val="fr_FR" w:bidi="fr_FR"/>
+        </w:rPr>
+        <w:t>Deutéronome 25.5–6</w:t>
+      </w:r>
       <w:r>
         <w:rPr>
           <w:lang w:val="fr_FR" w:bidi="fr_FR"/>
@@ -4042,18 +3790,12 @@
         </w:rPr>
         <w:t xml:space="preserve"> Voir cependant </w:t>
       </w:r>
-      <w:hyperlink r:id="rId55">
-        <w:r>
-          <w:rPr>
-            <w:lang w:val="fr_FR" w:bidi="fr_FR"/>
-          </w:rPr>
-          <w:rPr>
-            <w:color w:val="0000EE"/>
-            <w:u w:val="single"/>
-          </w:rPr>
-          <w:t>Deutéronome 25.5–10</w:t>
-        </w:r>
-      </w:hyperlink>
+      <w:r>
+        <w:rPr>
+          <w:lang w:val="fr_FR" w:bidi="fr_FR"/>
+        </w:rPr>
+        <w:t>Deutéronome 25.5–10</w:t>
+      </w:r>
       <w:r>
         <w:rPr>
           <w:lang w:val="fr_FR" w:bidi="fr_FR"/>
@@ -4300,18 +4042,12 @@
         </w:rPr>
         <w:t xml:space="preserve"> Il est possible que le nom « Éphrata » ait été l’ancien nom de Bethléhem (d’où la formulation du verset </w:t>
       </w:r>
-      <w:hyperlink r:id="rId56">
-        <w:r>
-          <w:rPr>
-            <w:lang w:val="fr_FR" w:bidi="fr_FR"/>
-          </w:rPr>
-          <w:rPr>
-            <w:color w:val="0000EE"/>
-            <w:u w:val="single"/>
-          </w:rPr>
-          <w:t>1.2</w:t>
-        </w:r>
-      </w:hyperlink>
+      <w:r>
+        <w:rPr>
+          <w:lang w:val="fr_FR" w:bidi="fr_FR"/>
+        </w:rPr>
+        <w:t>1.2</w:t>
+      </w:r>
       <w:r>
         <w:rPr>
           <w:lang w:val="fr_FR" w:bidi="fr_FR"/>

</xml_diff>